<commit_message>
edited initial design spec
</commit_message>
<xml_diff>
--- a/Group69/40485522 - Eoghan/40485522 Design_Spec.docx
+++ b/Group69/40485522 - Eoghan/40485522 Design_Spec.docx
@@ -51,6 +51,87 @@
           <w:color w:val="000000" w:themeColor="text1"/>
         </w:rPr>
       </w:pPr>
+      <w:r>
+        <w:rPr>
+          <w:color w:val="000000" w:themeColor="text1"/>
+        </w:rPr>
+        <w:t>The goal of my project is to</w:t>
+      </w:r>
+      <w:r>
+        <w:rPr>
+          <w:color w:val="000000" w:themeColor="text1"/>
+        </w:rPr>
+        <w:t xml:space="preserve"> make information more digestible to increase to increase knowledge</w:t>
+      </w:r>
+      <w:r>
+        <w:rPr>
+          <w:color w:val="000000" w:themeColor="text1"/>
+        </w:rPr>
+        <w:t xml:space="preserve"> about the most important areas when it comes to </w:t>
+      </w:r>
+      <w:r>
+        <w:rPr>
+          <w:color w:val="000000" w:themeColor="text1"/>
+        </w:rPr>
+        <w:t xml:space="preserve">mobile service and internet access </w:t>
+      </w:r>
+      <w:r>
+        <w:rPr>
+          <w:color w:val="000000" w:themeColor="text1"/>
+        </w:rPr>
+        <w:t>to</w:t>
+      </w:r>
+      <w:r>
+        <w:rPr>
+          <w:color w:val="000000" w:themeColor="text1"/>
+        </w:rPr>
+        <w:t xml:space="preserve"> promote competition and inform consumers. This type of activity might be described as reporting.</w:t>
+      </w:r>
+      <w:r>
+        <w:rPr>
+          <w:color w:val="000000" w:themeColor="text1"/>
+        </w:rPr>
+        <w:t xml:space="preserve"> </w:t>
+      </w:r>
+    </w:p>
+    <w:p>
+      <w:pPr>
+        <w:rPr>
+          <w:color w:val="000000" w:themeColor="text1"/>
+        </w:rPr>
+      </w:pPr>
+      <w:r>
+        <w:rPr>
+          <w:color w:val="000000" w:themeColor="text1"/>
+        </w:rPr>
+        <w:t xml:space="preserve">The Organisation I have decided to focus on for my project is the </w:t>
+      </w:r>
+      <w:r>
+        <w:rPr>
+          <w:color w:val="000000" w:themeColor="text1"/>
+        </w:rPr>
+        <w:t>Commission for Communications Regulation</w:t>
+      </w:r>
+      <w:r>
+        <w:rPr>
+          <w:color w:val="000000" w:themeColor="text1"/>
+        </w:rPr>
+        <w:t>.</w:t>
+      </w:r>
+      <w:r>
+        <w:rPr>
+          <w:color w:val="000000" w:themeColor="text1"/>
+        </w:rPr>
+        <w:t xml:space="preserve"> </w:t>
+      </w:r>
+      <w:hyperlink r:id="rId4" w:history="1">
+        <w:r>
+          <w:rPr>
+            <w:rStyle w:val="Hyperlink"/>
+          </w:rPr>
+          <w:t>https://www.comreg.ie/about/foi-aie-info/who-we-are-and-what-we-do/</w:t>
+        </w:r>
+      </w:hyperlink>
     </w:p>
     <w:p>
       <w:pPr>
@@ -228,6 +309,7 @@
         <w:rPr>
           <w:color w:val="000000" w:themeColor="text1"/>
         </w:rPr>
+        <w:lastRenderedPageBreak/>
         <w:t>Initial Data Model (ERD)</w:t>
       </w:r>
     </w:p>
@@ -268,14 +350,7 @@
         <w:rPr>
           <w:color w:val="000000" w:themeColor="text1"/>
         </w:rPr>
-        <w:t xml:space="preserve">Provide a short bullet list of the main Create, Update, and Delete operations the system must support. Focus on core needs, not every possible action. You should also include </w:t>
-      </w:r>
-      <w:r>
-        <w:rPr>
-          <w:color w:val="000000" w:themeColor="text1"/>
-        </w:rPr>
-        <w:lastRenderedPageBreak/>
-        <w:t xml:space="preserve">a list of initial reporting ideas to include the business questions you aim to answer and how these might be parameterised. </w:t>
+        <w:t xml:space="preserve">Provide a short bullet list of the main Create, Update, and Delete operations the system must support. Focus on core needs, not every possible action. You should also include a list of initial reporting ideas to include the business questions you aim to answer and how these might be parameterised. </w:t>
       </w:r>
     </w:p>
     <w:p>
@@ -1235,6 +1310,29 @@
       <w:spacing w:val="5"/>
     </w:rPr>
   </w:style>
+  <w:style w:type="character" w:styleId="Hyperlink">
+    <w:name w:val="Hyperlink"/>
+    <w:basedOn w:val="DefaultParagraphFont"/>
+    <w:uiPriority w:val="99"/>
+    <w:unhideWhenUsed/>
+    <w:rsid w:val="006253D7"/>
+    <w:rPr>
+      <w:color w:val="467886" w:themeColor="hyperlink"/>
+      <w:u w:val="single"/>
+    </w:rPr>
+  </w:style>
+  <w:style w:type="character" w:styleId="UnresolvedMention">
+    <w:name w:val="Unresolved Mention"/>
+    <w:basedOn w:val="DefaultParagraphFont"/>
+    <w:uiPriority w:val="99"/>
+    <w:semiHidden/>
+    <w:unhideWhenUsed/>
+    <w:rsid w:val="006253D7"/>
+    <w:rPr>
+      <w:color w:val="605E5C"/>
+      <w:shd w:val="clear" w:color="auto" w:fill="E1DFDD"/>
+    </w:rPr>
+  </w:style>
 </w:styles>
 </file>
 

</xml_diff>